<commit_message>
lineer regression and decision tree
</commit_message>
<xml_diff>
--- a/gold-oil-war/Gold-Oil_GPR.docx
+++ b/gold-oil-war/Gold-Oil_GPR.docx
@@ -36,110 +36,7 @@
           <w:sz w:val="40"/>
           <w:szCs w:val="40"/>
         </w:rPr>
-        <w:t xml:space="preserve">, I got data as 2 parts. First one is between 2000 and 2020, second one is between 2020 and 2026. As a result, I had to concatenate these data frames using pandas and I did so, </w:t>
-      </w:r>
-      <w:proofErr w:type="gramStart"/>
-      <w:r>
-        <w:rPr>
-          <w:rFonts w:ascii="AppleSystemUIFont" w:hAnsi="AppleSystemUIFont" w:cs="AppleSystemUIFont"/>
-          <w:b/>
-          <w:bCs/>
-          <w:kern w:val="0"/>
-          <w:sz w:val="40"/>
-          <w:szCs w:val="40"/>
-        </w:rPr>
-        <w:t>using .</w:t>
-      </w:r>
-      <w:proofErr w:type="spellStart"/>
-      <w:r>
-        <w:rPr>
-          <w:rFonts w:ascii="AppleSystemUIFont" w:hAnsi="AppleSystemUIFont" w:cs="AppleSystemUIFont"/>
-          <w:b/>
-          <w:bCs/>
-          <w:kern w:val="0"/>
-          <w:sz w:val="40"/>
-          <w:szCs w:val="40"/>
-        </w:rPr>
-        <w:t>concat</w:t>
-      </w:r>
-      <w:proofErr w:type="spellEnd"/>
-      <w:proofErr w:type="gramEnd"/>
-      <w:r>
-        <w:rPr>
-          <w:rFonts w:ascii="AppleSystemUIFont" w:hAnsi="AppleSystemUIFont" w:cs="AppleSystemUIFont"/>
-          <w:b/>
-          <w:bCs/>
-          <w:kern w:val="0"/>
-          <w:sz w:val="40"/>
-          <w:szCs w:val="40"/>
-        </w:rPr>
-        <w:t xml:space="preserve">() method. Also, I got the data of GRP as between 1985-2026. </w:t>
-      </w:r>
-      <w:r>
-        <w:rPr>
-          <w:rFonts w:ascii="AppleSystemUIFont" w:hAnsi="AppleSystemUIFont" w:cs="AppleSystemUIFont"/>
-          <w:b/>
-          <w:bCs/>
-          <w:kern w:val="0"/>
-          <w:sz w:val="40"/>
-          <w:szCs w:val="40"/>
-        </w:rPr>
-        <w:t>So,</w:t>
-      </w:r>
-      <w:r>
-        <w:rPr>
-          <w:rFonts w:ascii="AppleSystemUIFont" w:hAnsi="AppleSystemUIFont" w:cs="AppleSystemUIFont"/>
-          <w:b/>
-          <w:bCs/>
-          <w:kern w:val="0"/>
-          <w:sz w:val="40"/>
-          <w:szCs w:val="40"/>
-        </w:rPr>
-        <w:t xml:space="preserve"> I filtered the date and took the relevant part. I faced a problem of that date columns of oil and gold data was not identical. I had to use intersection of the dates. I calculated some statistical concepts of the data. I have mean, </w:t>
-      </w:r>
-      <w:r>
-        <w:rPr>
-          <w:rFonts w:ascii="AppleSystemUIFont" w:hAnsi="AppleSystemUIFont" w:cs="AppleSystemUIFont"/>
-          <w:b/>
-          <w:bCs/>
-          <w:kern w:val="0"/>
-          <w:sz w:val="40"/>
-          <w:szCs w:val="40"/>
-        </w:rPr>
-        <w:t>standard</w:t>
-      </w:r>
-      <w:r>
-        <w:rPr>
-          <w:rFonts w:ascii="AppleSystemUIFont" w:hAnsi="AppleSystemUIFont" w:cs="AppleSystemUIFont"/>
-          <w:b/>
-          <w:bCs/>
-          <w:kern w:val="0"/>
-          <w:sz w:val="40"/>
-          <w:szCs w:val="40"/>
-        </w:rPr>
-        <w:t xml:space="preserve"> deviation, max, min and quartiles. Spearman correlation between Gold and Oil prices is “0.6”. To elaborate on whether this is a coincidence or there is a real correlation, I will apply hypothesis testing.  Initially, I declare my Null hypothesis as “Gold and Oil prices are completely independent, there is no </w:t>
-      </w:r>
-      <w:r>
-        <w:rPr>
-          <w:rFonts w:ascii="AppleSystemUIFont" w:hAnsi="AppleSystemUIFont" w:cs="AppleSystemUIFont"/>
-          <w:b/>
-          <w:bCs/>
-          <w:kern w:val="0"/>
-          <w:sz w:val="40"/>
-          <w:szCs w:val="40"/>
-        </w:rPr>
-        <w:t>correlation between</w:t>
-      </w:r>
-      <w:r>
-        <w:rPr>
-          <w:rFonts w:ascii="AppleSystemUIFont" w:hAnsi="AppleSystemUIFont" w:cs="AppleSystemUIFont"/>
-          <w:b/>
-          <w:bCs/>
-          <w:kern w:val="0"/>
-          <w:sz w:val="40"/>
-          <w:szCs w:val="40"/>
-        </w:rPr>
-        <w:t xml:space="preserve"> them.”. After that, I declare my alternative hypothesis as </w:t>
+        <w:t xml:space="preserve">, I got data as 2 parts. First one is between 2000 and 2020, second one is between 2020 and 2026. As a result, I had to concatenate these data frames using pandas and I did so, using .concat() method. Also, I got the data of GRP as between 1985-2026. So I filtered the date and took the relevant part. I faced a problem of that date columns of oil and gold data was not identical. I had to use intersection of the dates. I calculated some statistical concepts of the data. I have mean, standart deviation, max, min and quartiles. Spearman correlation between Gold and Oil prices is “0.6”. To elaborate on whether this is a coincidence or there is a real correlation, I will apply hypothesis testing.  Initially, I declare my Null hypothesis as “Gold and Oil prices are completely independent, there is no correlation  between them.”. After that, I declare my alternative hypothesis as </w:t>
       </w:r>
       <w:r>
         <w:rPr>
@@ -163,7 +60,7 @@
           <w:szCs w:val="40"/>
         </w:rPr>
         <w:tab/>
-        <w:t xml:space="preserve">that it is so much less then alpha, rejecting H0 and proofing that Gold and Oil prices are strongly correlated.      </w:t>
+        <w:t>that it is so much less then alpha, rejecting H0 and proofing that Gold and Oil prices are strongly correlated. I applied same process to inspect whether gold and oil prices are correlated with GPR index. As a conclusion, I found out that oil and gold prices have a meaningful correlation with GPR index, however what I find interesting is that p value for gold and oil correlation is much more smaller than p value for such commodities and GPR index correlation. So, firs correlation is stronger but the both of them are still meaningful correlations.</w:t>
       </w:r>
     </w:p>
     <w:sectPr>

</xml_diff>